<commit_message>
Update - Latest Code
</commit_message>
<xml_diff>
--- a/CPH Allocation Day 2/Assets/Perm Cph - Copy.docx
+++ b/CPH Allocation Day 2/Assets/Perm Cph - Copy.docx
@@ -317,28 +317,17 @@
           <w:lang w:eastAsia="en-GB"/>
           <w14:ligatures w14:val="none"/>
         </w:rPr>
-        <w:t xml:space="preserve">Thank you for contacting us to request </w:t>
-      </w:r>
-      <w:r>
-        <w:rPr>
-          <w:rFonts w:ascii="Arial" w:eastAsia="Times New Roman" w:hAnsi="Arial" w:cs="Arial"/>
-          <w:color w:val="0000FF"/>
+        <w:t xml:space="preserve">Thank you for contacting us to </w:t>
+      </w:r>
+      <w:r>
+        <w:rPr>
+          <w:rFonts w:ascii="Arial" w:eastAsia="Times New Roman" w:hAnsi="Arial" w:cs="Arial"/>
           <w:kern w:val="0"/>
           <w:shd w:val="clear" w:color="auto" w:fill="FFFFFF"/>
           <w:lang w:eastAsia="en-GB"/>
           <w14:ligatures w14:val="none"/>
         </w:rPr>
-        <w:t>a CPH number</w:t>
-      </w:r>
-      <w:r>
-        <w:rPr>
-          <w:rFonts w:ascii="Arial" w:eastAsia="Times New Roman" w:hAnsi="Arial" w:cs="Arial"/>
-          <w:kern w:val="0"/>
-          <w:shd w:val="clear" w:color="auto" w:fill="FFFFFF"/>
-          <w:lang w:eastAsia="en-GB"/>
-          <w14:ligatures w14:val="none"/>
-        </w:rPr>
-        <w:t xml:space="preserve"> </w:t>
+        <w:t xml:space="preserve">request a CPH number </w:t>
       </w:r>
       <w:r>
         <w:rPr>

</xml_diff>